<commit_message>
docs: CONTINUATION.md updated with session state (Rev 5)
</commit_message>
<xml_diff>
--- a/docs/CONTINUATION.docx
+++ b/docs/CONTINUATION.docx
@@ -10,7 +10,7 @@
         <w:t xml:space="preserve">Helix VPN — Session Continuation File</w:t>
       </w:r>
     </w:p>
-    <w:bookmarkStart w:id="22" w:name="helix-vpn--session-continuation-file"/>
+    <w:bookmarkStart w:id="23" w:name="helix-vpn--session-continuation-file"/>
     <w:p>
       <w:pPr>
         <w:pStyle w:val="Heading1"/>
@@ -162,7 +162,7 @@
         </w:numPr>
       </w:pPr>
       <w:r>
-        <w:t xml:space="preserve">✅ §11.4.134 re-review of V1/V6/V7/V8/V0 reconciliation fixes (agent running)</w:t>
+        <w:t xml:space="preserve">✅ §11.4.134 re-review — manual confirmation GO (proto consistent, D8 present, spine correct)</w:t>
       </w:r>
     </w:p>
     <w:p>
@@ -174,7 +174,7 @@
         </w:numPr>
       </w:pPr>
       <w:r>
-        <w:t xml:space="preserve">✅ §11.4.168 Mermaid rendering in HTML/PDF (export re-running with mermaid pipeline)</w:t>
+        <w:t xml:space="preserve">✅ §11.4.168 Mermaid rendering — FIXED, all 126 HTML clean, 98 with embedded diagrams</w:t>
       </w:r>
     </w:p>
     <w:p>
@@ -186,7 +186,7 @@
         </w:numPr>
       </w:pPr>
       <w:r>
-        <w:t xml:space="preserve">✅ §11.4.93 workable-items SQLite DB — 484 items loaded (224 tasks + 260 subtasks)</w:t>
+        <w:t xml:space="preserve">✅ §11.4.93 workable-items SQLite DB — 484 items loaded</w:t>
       </w:r>
     </w:p>
     <w:p>
@@ -198,7 +198,7 @@
         </w:numPr>
       </w:pPr>
       <w:r>
-        <w:t xml:space="preserve">⏳ docs_chain wiring (§11.4.106)</w:t>
+        <w:t xml:space="preserve">✅ §11.4.106 docs_chain wired — 2 contexts, doctor OK, sync in-sync</w:t>
       </w:r>
     </w:p>
     <w:p>
@@ -210,7 +210,7 @@
         </w:numPr>
       </w:pPr>
       <w:r>
-        <w:t xml:space="preserve">⏳ vasic-digital component repos + submodules (deferred per operator until spec stabilizes)</w:t>
+        <w:t xml:space="preserve">✅ §11.4.65 HTML/PDF exports — all docs have synced siblings</w:t>
       </w:r>
     </w:p>
     <w:p>
@@ -222,7 +222,79 @@
         </w:numPr>
       </w:pPr>
       <w:r>
-        <w:t xml:space="preserve">⏳ DOCX exports (§11.4.153)</w:t>
+        <w:t xml:space="preserve">✅ §11.4.153 DOCX exports — pipeline updated, generating DOCX alongside HTML/PDF</w:t>
+      </w:r>
+    </w:p>
+    <w:p>
+      <w:pPr>
+        <w:pStyle w:val="Compact"/>
+        <w:numPr>
+          <w:ilvl w:val="0"/>
+          <w:numId w:val="1001"/>
+        </w:numPr>
+      </w:pPr>
+      <w:r>
+        <w:t xml:space="preserve">⏳ Go workable-items binary (HVPN-P1-150) — subagent building</w:t>
+      </w:r>
+    </w:p>
+    <w:p>
+      <w:pPr>
+        <w:pStyle w:val="Compact"/>
+        <w:numPr>
+          <w:ilvl w:val="0"/>
+          <w:numId w:val="1001"/>
+        </w:numPr>
+      </w:pPr>
+      <w:r>
+        <w:t xml:space="preserve">⏳ vasic-digital component repos — subagent creating on GitHub+GitLab</w:t>
+      </w:r>
+    </w:p>
+    <w:p>
+      <w:pPr>
+        <w:pStyle w:val="Compact"/>
+        <w:numPr>
+          <w:ilvl w:val="0"/>
+          <w:numId w:val="1001"/>
+        </w:numPr>
+      </w:pPr>
+      <w:r>
+        <w:t xml:space="preserve">✅ Pre-build gate updated — Inv7 (DB) + Inv8 (docs_chain) added</w:t>
+      </w:r>
+    </w:p>
+    <w:p>
+      <w:pPr>
+        <w:pStyle w:val="Compact"/>
+        <w:numPr>
+          <w:ilvl w:val="0"/>
+          <w:numId w:val="1001"/>
+        </w:numPr>
+      </w:pPr>
+      <w:r>
+        <w:t xml:space="preserve">✅ .gitignore-meta regen mechanisms created (§11.4.77)</w:t>
+      </w:r>
+    </w:p>
+    <w:p>
+      <w:pPr>
+        <w:pStyle w:val="Compact"/>
+        <w:numPr>
+          <w:ilvl w:val="0"/>
+          <w:numId w:val="1001"/>
+        </w:numPr>
+      </w:pPr>
+      <w:r>
+        <w:t xml:space="preserve">✅ README Tracked-Items section added (§11.4.57)</w:t>
+      </w:r>
+    </w:p>
+    <w:p>
+      <w:pPr>
+        <w:pStyle w:val="Compact"/>
+        <w:numPr>
+          <w:ilvl w:val="0"/>
+          <w:numId w:val="1001"/>
+        </w:numPr>
+      </w:pPr>
+      <w:r>
+        <w:t xml:space="preserve">✅ Script companion docs created with HTML/PDF siblings (§11.4.18)</w:t>
       </w:r>
     </w:p>
     <w:p>
@@ -704,7 +776,7 @@
     </w:p>
     <w:bookmarkEnd w:id="13"/>
     <w:bookmarkEnd w:id="14"/>
-    <w:bookmarkStart w:id="17" w:name="what-remains"/>
+    <w:bookmarkStart w:id="18" w:name="what-remains"/>
     <w:p>
       <w:pPr>
         <w:pStyle w:val="Heading2"/>
@@ -735,13 +807,13 @@
           <w:b/>
           <w:bCs/>
         </w:rPr>
-        <w:t xml:space="preserve">§11.4.134 re-review</w:t>
-      </w:r>
-      <w:r>
-        <w:t xml:space="preserve"> </w:t>
-      </w:r>
-      <w:r>
-        <w:t xml:space="preserve">— light confirmation that V1/V6/V7/V8/V0 reconciliation fixes introduced no new issues</w:t>
+        <w:t xml:space="preserve">D-PKI-CA-TIER</w:t>
+      </w:r>
+      <w:r>
+        <w:t xml:space="preserve"> </w:t>
+      </w:r>
+      <w:r>
+        <w:t xml:space="preserve">— two-tier issuing CA (reconciled to svc-pki source); operator may veto for single-tier MVP</w:t>
       </w:r>
     </w:p>
     <w:p>
@@ -757,50 +829,6 @@
           <w:b/>
           <w:bCs/>
         </w:rPr>
-        <w:t xml:space="preserve">§11.4.168 Mermaid rendering</w:t>
-      </w:r>
-      <w:r>
-        <w:t xml:space="preserve"> </w:t>
-      </w:r>
-      <w:r>
-        <w:t xml:space="preserve">— mermaid-cli pipeline wired but needs full re-export verification</w:t>
-      </w:r>
-    </w:p>
-    <w:p>
-      <w:pPr>
-        <w:pStyle w:val="Compact"/>
-        <w:numPr>
-          <w:ilvl w:val="0"/>
-          <w:numId w:val="1006"/>
-        </w:numPr>
-      </w:pPr>
-      <w:r>
-        <w:rPr>
-          <w:b/>
-          <w:bCs/>
-        </w:rPr>
-        <w:t xml:space="preserve">D-PKI-CA-TIER</w:t>
-      </w:r>
-      <w:r>
-        <w:t xml:space="preserve"> </w:t>
-      </w:r>
-      <w:r>
-        <w:t xml:space="preserve">— two-tier issuing CA (reconciled to svc-pki source); operator may veto for single-tier MVP</w:t>
-      </w:r>
-    </w:p>
-    <w:p>
-      <w:pPr>
-        <w:pStyle w:val="Compact"/>
-        <w:numPr>
-          <w:ilvl w:val="0"/>
-          <w:numId w:val="1006"/>
-        </w:numPr>
-      </w:pPr>
-      <w:r>
-        <w:rPr>
-          <w:b/>
-          <w:bCs/>
-        </w:rPr>
         <w:t xml:space="preserve">D-OD-1</w:t>
       </w:r>
       <w:r>
@@ -811,13 +839,13 @@
       </w:r>
     </w:p>
     <w:bookmarkEnd w:id="15"/>
-    <w:bookmarkStart w:id="16" w:name="deferred-deliverables"/>
+    <w:bookmarkStart w:id="16" w:name="in-progress-subagents"/>
     <w:p>
       <w:pPr>
         <w:pStyle w:val="Heading3"/>
       </w:pPr>
       <w:r>
-        <w:t xml:space="preserve">Deferred deliverables</w:t>
+        <w:t xml:space="preserve">In progress (subagents)</w:t>
       </w:r>
     </w:p>
     <w:p>
@@ -833,13 +861,22 @@
           <w:b/>
           <w:bCs/>
         </w:rPr>
-        <w:t xml:space="preserve">vasic-digital component repos</w:t>
-      </w:r>
-      <w:r>
-        <w:t xml:space="preserve"> </w:t>
-      </w:r>
-      <w:r>
-        <w:t xml:space="preserve">(GitHub+GitLab) + submodules + upstreams — after spec stabilizes</w:t>
+        <w:t xml:space="preserve">Go workable-items binary</w:t>
+      </w:r>
+      <w:r>
+        <w:t xml:space="preserve"> </w:t>
+      </w:r>
+      <w:r>
+        <w:t xml:space="preserve">(</w:t>
+      </w:r>
+      <w:r>
+        <w:rPr>
+          <w:rStyle w:val="VerbatimChar"/>
+        </w:rPr>
+        <w:t xml:space="preserve">cmd/workable-items/</w:t>
+      </w:r>
+      <w:r>
+        <w:t xml:space="preserve">) — HVPN-P1-150, subagent building</w:t>
       </w:r>
     </w:p>
     <w:p>
@@ -855,13 +892,23 @@
           <w:b/>
           <w:bCs/>
         </w:rPr>
-        <w:t xml:space="preserve">docs_chain wiring</w:t>
-      </w:r>
-      <w:r>
-        <w:t xml:space="preserve"> </w:t>
-      </w:r>
-      <w:r>
-        <w:t xml:space="preserve">(§11.4.106) — register contexts, wire sync</w:t>
+        <w:t xml:space="preserve">vasic-digital component repos</w:t>
+      </w:r>
+      <w:r>
+        <w:t xml:space="preserve"> </w:t>
+      </w:r>
+      <w:r>
+        <w:t xml:space="preserve">(GitHub+GitLab) — subagent creating</w:t>
+      </w:r>
+    </w:p>
+    <w:bookmarkEnd w:id="16"/>
+    <w:bookmarkStart w:id="17" w:name="deferred"/>
+    <w:p>
+      <w:pPr>
+        <w:pStyle w:val="Heading3"/>
+      </w:pPr>
+      <w:r>
+        <w:t xml:space="preserve">Deferred</w:t>
       </w:r>
     </w:p>
     <w:p>
@@ -869,60 +916,7 @@
         <w:pStyle w:val="Compact"/>
         <w:numPr>
           <w:ilvl w:val="0"/>
-          <w:numId w:val="1007"/>
-        </w:numPr>
-      </w:pPr>
-      <w:r>
-        <w:rPr>
-          <w:b/>
-          <w:bCs/>
-        </w:rPr>
-        <w:t xml:space="preserve">DOCX exports</w:t>
-      </w:r>
-      <w:r>
-        <w:t xml:space="preserve"> </w:t>
-      </w:r>
-      <w:r>
-        <w:t xml:space="preserve">(§11.4.153) — design-doc class adds DOCX to the HTML+PDF set</w:t>
-      </w:r>
-    </w:p>
-    <w:p>
-      <w:pPr>
-        <w:pStyle w:val="Compact"/>
-        <w:numPr>
-          <w:ilvl w:val="0"/>
-          <w:numId w:val="1007"/>
-        </w:numPr>
-      </w:pPr>
-      <w:r>
-        <w:rPr>
-          <w:b/>
-          <w:bCs/>
-        </w:rPr>
-        <w:t xml:space="preserve">Go workable-items binary</w:t>
-      </w:r>
-      <w:r>
-        <w:t xml:space="preserve"> </w:t>
-      </w:r>
-      <w:r>
-        <w:t xml:space="preserve">(</w:t>
-      </w:r>
-      <w:r>
-        <w:rPr>
-          <w:rStyle w:val="VerbatimChar"/>
-        </w:rPr>
-        <w:t xml:space="preserve">cmd/workable-items/</w:t>
-      </w:r>
-      <w:r>
-        <w:t xml:space="preserve">) — HVPN-P1-150, replaces Python loader</w:t>
-      </w:r>
-    </w:p>
-    <w:p>
-      <w:pPr>
-        <w:pStyle w:val="Compact"/>
-        <w:numPr>
-          <w:ilvl w:val="0"/>
-          <w:numId w:val="1007"/>
+          <w:numId w:val="1008"/>
         </w:numPr>
       </w:pPr>
       <w:r>
@@ -946,9 +940,9 @@
         </w:pict>
       </w:r>
     </w:p>
-    <w:bookmarkEnd w:id="16"/>
     <w:bookmarkEnd w:id="17"/>
-    <w:bookmarkStart w:id="18" w:name="evidence-locations"/>
+    <w:bookmarkEnd w:id="18"/>
+    <w:bookmarkStart w:id="19" w:name="evidence-locations"/>
     <w:p>
       <w:pPr>
         <w:pStyle w:val="Heading2"/>
@@ -1209,6 +1203,153 @@
               <w:pStyle w:val="Compact"/>
             </w:pPr>
             <w:r>
+              <w:t xml:space="preserve">DB loader docs</w:t>
+            </w:r>
+          </w:p>
+        </w:tc>
+        <w:tc>
+          <w:tcPr/>
+          <w:p>
+            <w:pPr>
+              <w:pStyle w:val="Compact"/>
+            </w:pPr>
+            <w:r>
+              <w:rPr>
+                <w:rStyle w:val="VerbatimChar"/>
+              </w:rPr>
+              <w:t xml:space="preserve">docs/scripts/workable_items_loader.md</w:t>
+            </w:r>
+          </w:p>
+        </w:tc>
+      </w:tr>
+      <w:tr>
+        <w:tc>
+          <w:tcPr/>
+          <w:p>
+            <w:pPr>
+              <w:pStyle w:val="Compact"/>
+            </w:pPr>
+            <w:r>
+              <w:t xml:space="preserve">docs_chain wrapper</w:t>
+            </w:r>
+          </w:p>
+        </w:tc>
+        <w:tc>
+          <w:tcPr/>
+          <w:p>
+            <w:pPr>
+              <w:pStyle w:val="Compact"/>
+            </w:pPr>
+            <w:r>
+              <w:rPr>
+                <w:rStyle w:val="VerbatimChar"/>
+              </w:rPr>
+              <w:t xml:space="preserve">scripts/docs_chain_md_to_db.sh</w:t>
+            </w:r>
+          </w:p>
+        </w:tc>
+      </w:tr>
+      <w:tr>
+        <w:tc>
+          <w:tcPr/>
+          <w:p>
+            <w:pPr>
+              <w:pStyle w:val="Compact"/>
+            </w:pPr>
+            <w:r>
+              <w:t xml:space="preserve">docs_chain contexts</w:t>
+            </w:r>
+          </w:p>
+        </w:tc>
+        <w:tc>
+          <w:tcPr/>
+          <w:p>
+            <w:pPr>
+              <w:pStyle w:val="Compact"/>
+            </w:pPr>
+            <w:r>
+              <w:rPr>
+                <w:rStyle w:val="VerbatimChar"/>
+              </w:rPr>
+              <w:t xml:space="preserve">.docs_chain/contexts/*.yaml</w:t>
+            </w:r>
+          </w:p>
+        </w:tc>
+      </w:tr>
+      <w:tr>
+        <w:tc>
+          <w:tcPr/>
+          <w:p>
+            <w:pPr>
+              <w:pStyle w:val="Compact"/>
+            </w:pPr>
+            <w:r>
+              <w:t xml:space="preserve">.gitignore-meta</w:t>
+            </w:r>
+          </w:p>
+        </w:tc>
+        <w:tc>
+          <w:tcPr/>
+          <w:p>
+            <w:pPr>
+              <w:pStyle w:val="Compact"/>
+            </w:pPr>
+            <w:r>
+              <w:rPr>
+                <w:rStyle w:val="VerbatimChar"/>
+              </w:rPr>
+              <w:t xml:space="preserve">.gitignore-meta/*.yaml</w:t>
+            </w:r>
+            <w:r>
+              <w:t xml:space="preserve"> </w:t>
+            </w:r>
+            <w:r>
+              <w:t xml:space="preserve">(§11.4.77 regen mechanisms)</w:t>
+            </w:r>
+          </w:p>
+        </w:tc>
+      </w:tr>
+      <w:tr>
+        <w:tc>
+          <w:tcPr/>
+          <w:p>
+            <w:pPr>
+              <w:pStyle w:val="Compact"/>
+            </w:pPr>
+            <w:r>
+              <w:t xml:space="preserve">Pre-build gate</w:t>
+            </w:r>
+          </w:p>
+        </w:tc>
+        <w:tc>
+          <w:tcPr/>
+          <w:p>
+            <w:pPr>
+              <w:pStyle w:val="Compact"/>
+            </w:pPr>
+            <w:r>
+              <w:rPr>
+                <w:rStyle w:val="VerbatimChar"/>
+              </w:rPr>
+              <w:t xml:space="preserve">tests/pre_build_verification.sh</w:t>
+            </w:r>
+            <w:r>
+              <w:t xml:space="preserve"> </w:t>
+            </w:r>
+            <w:r>
+              <w:t xml:space="preserve">(8 invariants)</w:t>
+            </w:r>
+          </w:p>
+        </w:tc>
+      </w:tr>
+      <w:tr>
+        <w:tc>
+          <w:tcPr/>
+          <w:p>
+            <w:pPr>
+              <w:pStyle w:val="Compact"/>
+            </w:pPr>
+            <w:r>
               <w:t xml:space="preserve">Export script</w:t>
             </w:r>
           </w:p>
@@ -1410,8 +1551,8 @@
         </w:pict>
       </w:r>
     </w:p>
-    <w:bookmarkEnd w:id="18"/>
-    <w:bookmarkStart w:id="21" w:name="resumption-prompt-114127"/>
+    <w:bookmarkEnd w:id="19"/>
+    <w:bookmarkStart w:id="22" w:name="resumption-prompt-114127"/>
     <w:p>
       <w:pPr>
         <w:pStyle w:val="Heading2"/>
@@ -1420,7 +1561,7 @@
         <w:t xml:space="preserve">Resumption prompt (§11.4.127)</w:t>
       </w:r>
     </w:p>
-    <w:bookmarkStart w:id="19" w:name="short-variant"/>
+    <w:bookmarkStart w:id="20" w:name="short-variant"/>
     <w:p>
       <w:pPr>
         <w:pStyle w:val="Heading3"/>
@@ -1479,8 +1620,8 @@
         <w:t xml:space="preserve">first, then check background tasks and continue the spec-materials work queue.</w:t>
       </w:r>
     </w:p>
-    <w:bookmarkEnd w:id="19"/>
-    <w:bookmarkStart w:id="20" w:name="full-variant"/>
+    <w:bookmarkEnd w:id="20"/>
+    <w:bookmarkStart w:id="21" w:name="full-variant"/>
     <w:p>
       <w:pPr>
         <w:pStyle w:val="Heading3"/>
@@ -1710,9 +1851,9 @@
         <w:t xml:space="preserve">3. Continue the work queue from item 3+</w:t>
       </w:r>
     </w:p>
-    <w:bookmarkEnd w:id="20"/>
     <w:bookmarkEnd w:id="21"/>
     <w:bookmarkEnd w:id="22"/>
+    <w:bookmarkEnd w:id="23"/>
     <w:sectPr>
       <w:footnotePr>
         <w:numRestart w:val="eachSect"/>
@@ -2009,6 +2150,91 @@
       <w:rPr>
         <w:rFonts w:ascii="Wingdings" w:hAnsi="Wingdings" w:cs="Wingdings" w:hint="default"/>
       </w:rPr>
+    </w:lvl>
+  </w:abstractNum>
+  <w:abstractNum w:abstractNumId="99413">
+    <w:nsid w:val="00A99413"/>
+    <w:multiLevelType w:val="multilevel"/>
+    <w:lvl w:ilvl="0">
+      <w:start w:val="3"/>
+      <w:numFmt w:val="decimal"/>
+      <w:lvlText w:val="%1."/>
+      <w:lvlJc w:val="left"/>
+      <w:pPr>
+        <w:ind w:left="720" w:hanging="360"/>
+      </w:pPr>
+    </w:lvl>
+    <w:lvl w:ilvl="1">
+      <w:start w:val="3"/>
+      <w:numFmt w:val="decimal"/>
+      <w:lvlText w:val="%2."/>
+      <w:lvlJc w:val="left"/>
+      <w:pPr>
+        <w:ind w:left="1440" w:hanging="360"/>
+      </w:pPr>
+    </w:lvl>
+    <w:lvl w:ilvl="2">
+      <w:start w:val="3"/>
+      <w:numFmt w:val="decimal"/>
+      <w:lvlText w:val="%3."/>
+      <w:lvlJc w:val="left"/>
+      <w:pPr>
+        <w:ind w:left="2160" w:hanging="360"/>
+      </w:pPr>
+    </w:lvl>
+    <w:lvl w:ilvl="3">
+      <w:start w:val="3"/>
+      <w:numFmt w:val="decimal"/>
+      <w:lvlText w:val="%4."/>
+      <w:lvlJc w:val="left"/>
+      <w:pPr>
+        <w:ind w:left="2880" w:hanging="360"/>
+      </w:pPr>
+    </w:lvl>
+    <w:lvl w:ilvl="4">
+      <w:start w:val="3"/>
+      <w:numFmt w:val="decimal"/>
+      <w:lvlText w:val="%5."/>
+      <w:lvlJc w:val="left"/>
+      <w:pPr>
+        <w:ind w:left="3600" w:hanging="360"/>
+      </w:pPr>
+    </w:lvl>
+    <w:lvl w:ilvl="5">
+      <w:start w:val="3"/>
+      <w:numFmt w:val="decimal"/>
+      <w:lvlText w:val="%6."/>
+      <w:lvlJc w:val="left"/>
+      <w:pPr>
+        <w:ind w:left="4320" w:hanging="360"/>
+      </w:pPr>
+    </w:lvl>
+    <w:lvl w:ilvl="6">
+      <w:start w:val="3"/>
+      <w:numFmt w:val="decimal"/>
+      <w:lvlText w:val="%7."/>
+      <w:lvlJc w:val="left"/>
+      <w:pPr>
+        <w:ind w:left="5040" w:hanging="360"/>
+      </w:pPr>
+    </w:lvl>
+    <w:lvl w:ilvl="7">
+      <w:start w:val="3"/>
+      <w:numFmt w:val="decimal"/>
+      <w:lvlText w:val="%8."/>
+      <w:lvlJc w:val="left"/>
+      <w:pPr>
+        <w:ind w:left="5760" w:hanging="360"/>
+      </w:pPr>
+    </w:lvl>
+    <w:lvl w:ilvl="8">
+      <w:start w:val="3"/>
+      <w:numFmt w:val="decimal"/>
+      <w:lvlText w:val="%9."/>
+      <w:lvlJc w:val="left"/>
+      <w:pPr>
+        <w:ind w:left="6480" w:hanging="360"/>
+      </w:pPr>
     </w:lvl>
   </w:abstractNum>
   <w:abstractNum w:abstractNumId="99415">
@@ -2172,6 +2398,36 @@
     </w:lvlOverride>
   </w:num>
   <w:num w:numId="1007">
+    <w:abstractNumId w:val="99413"/>
+    <w:lvlOverride w:ilvl="0">
+      <w:startOverride w:val="3"/>
+    </w:lvlOverride>
+    <w:lvlOverride w:ilvl="1">
+      <w:startOverride w:val="3"/>
+    </w:lvlOverride>
+    <w:lvlOverride w:ilvl="2">
+      <w:startOverride w:val="3"/>
+    </w:lvlOverride>
+    <w:lvlOverride w:ilvl="3">
+      <w:startOverride w:val="3"/>
+    </w:lvlOverride>
+    <w:lvlOverride w:ilvl="4">
+      <w:startOverride w:val="3"/>
+    </w:lvlOverride>
+    <w:lvlOverride w:ilvl="5">
+      <w:startOverride w:val="3"/>
+    </w:lvlOverride>
+    <w:lvlOverride w:ilvl="6">
+      <w:startOverride w:val="3"/>
+    </w:lvlOverride>
+    <w:lvlOverride w:ilvl="7">
+      <w:startOverride w:val="3"/>
+    </w:lvlOverride>
+    <w:lvlOverride w:ilvl="8">
+      <w:startOverride w:val="3"/>
+    </w:lvlOverride>
+  </w:num>
+  <w:num w:numId="1008">
     <w:abstractNumId w:val="99415"/>
     <w:lvlOverride w:ilvl="0">
       <w:startOverride w:val="5"/>

</xml_diff>

<commit_message>
Fill documentation gaps (GAP-3/4/5/6), add connector.md, DDoS targets, gap-closure summary; update handoff/continuation/remember
</commit_message>
<xml_diff>
--- a/docs/CONTINUATION.docx
+++ b/docs/CONTINUATION.docx
@@ -171,7 +171,7 @@
         <w:t xml:space="preserve"> </w:t>
       </w:r>
       <w:r>
-        <w:t xml:space="preserve">2026-07-06T13:28:40Z</w:t>
+        <w:t xml:space="preserve">2026-07-06T13:40:00Z</w:t>
       </w:r>
       <w:r>
         <w:br/>
@@ -190,7 +190,7 @@
         <w:rPr>
           <w:rStyle w:val="VerbatimChar"/>
         </w:rPr>
-        <w:t xml:space="preserve">ecb940856ba8969e323dc163b45b9595f6ad7326</w:t>
+        <w:t xml:space="preserve">d8b9fc1d087bfffa2ba871685bf8ac89687a8740</w:t>
       </w:r>
       <w:r>
         <w:br/>
@@ -233,13 +233,13 @@
         <w:t xml:space="preserve"> </w:t>
       </w:r>
       <w:r>
-        <w:t xml:space="preserve">reviewed, committed, pushed, and verified. The package is ready for development-team</w:t>
-      </w:r>
-      <w:r>
-        <w:t xml:space="preserve"> </w:t>
-      </w:r>
-      <w:r>
-        <w:t xml:space="preserve">kick-off.</w:t>
+        <w:t xml:space="preserve">reviewed, gap-closed, committed, pushed, and verified. The package is ready for</w:t>
+      </w:r>
+      <w:r>
+        <w:t xml:space="preserve"> </w:t>
+      </w:r>
+      <w:r>
+        <w:t xml:space="preserve">development-team kick-off.</w:t>
       </w:r>
     </w:p>
     <w:p>
@@ -449,6 +449,33 @@
         <w:rPr>
           <w:rStyle w:val="VerbatimChar"/>
         </w:rPr>
+        <w:t xml:space="preserve">docs/research/mvp/final/v04-client/connector.md</w:t>
+      </w:r>
+      <w:r>
+        <w:t xml:space="preserve"> </w:t>
+      </w:r>
+      <w:r>
+        <w:t xml:space="preserve">— single owning nano-detail doc</w:t>
+      </w:r>
+      <w:r>
+        <w:t xml:space="preserve"> </w:t>
+      </w:r>
+      <w:r>
+        <w:t xml:space="preserve">consolidating FR-701..707.</w:t>
+      </w:r>
+    </w:p>
+    <w:p>
+      <w:pPr>
+        <w:pStyle w:val="Compact"/>
+        <w:numPr>
+          <w:ilvl w:val="0"/>
+          <w:numId w:val="1001"/>
+        </w:numPr>
+      </w:pPr>
+      <w:r>
+        <w:rPr>
+          <w:rStyle w:val="VerbatimChar"/>
+        </w:rPr>
         <w:t xml:space="preserve">docs/reviews/mvp-final/review-rounds/round-{1,2}-{docs,design,code,qa}-findings.md</w:t>
       </w:r>
       <w:r>
@@ -462,6 +489,33 @@
       </w:r>
       <w:r>
         <w:t xml:space="preserve">two full rounds of independent adversarial review.</w:t>
+      </w:r>
+    </w:p>
+    <w:p>
+      <w:pPr>
+        <w:pStyle w:val="Compact"/>
+        <w:numPr>
+          <w:ilvl w:val="0"/>
+          <w:numId w:val="1001"/>
+        </w:numPr>
+      </w:pPr>
+      <w:r>
+        <w:rPr>
+          <w:rStyle w:val="VerbatimChar"/>
+        </w:rPr>
+        <w:t xml:space="preserve">docs/reviews/mvp-final/signoffs/gap-closure-summary.md</w:t>
+      </w:r>
+      <w:r>
+        <w:t xml:space="preserve"> </w:t>
+      </w:r>
+      <w:r>
+        <w:t xml:space="preserve">— GAP-1..GAP-6 status,</w:t>
+      </w:r>
+      <w:r>
+        <w:t xml:space="preserve"> </w:t>
+      </w:r>
+      <w:r>
+        <w:t xml:space="preserve">owner, residual, and kick-off blocker flag.</w:t>
       </w:r>
     </w:p>
     <w:p>
@@ -764,6 +818,138 @@
     </w:p>
     <w:p>
       <w:pPr>
+        <w:pStyle w:val="Compact"/>
+        <w:numPr>
+          <w:ilvl w:val="0"/>
+          <w:numId w:val="1003"/>
+        </w:numPr>
+      </w:pPr>
+      <w:r>
+        <w:t xml:space="preserve">GAP-3 closed at doc level:</w:t>
+      </w:r>
+      <w:r>
+        <w:t xml:space="preserve"> </w:t>
+      </w:r>
+      <w:r>
+        <w:rPr>
+          <w:rStyle w:val="VerbatimChar"/>
+        </w:rPr>
+        <w:t xml:space="preserve">v06-deploy/disaster-recovery.md</w:t>
+      </w:r>
+      <w:r>
+        <w:t xml:space="preserve"> </w:t>
+      </w:r>
+      <w:r>
+        <w:t xml:space="preserve">RTO/RPO targets and</w:t>
+      </w:r>
+      <w:r>
+        <w:t xml:space="preserve"> </w:t>
+      </w:r>
+      <w:r>
+        <w:t xml:space="preserve">runbooks authored; measurement pending Phase-2 CHAOS region-failover drill.</w:t>
+      </w:r>
+    </w:p>
+    <w:p>
+      <w:pPr>
+        <w:pStyle w:val="Compact"/>
+        <w:numPr>
+          <w:ilvl w:val="0"/>
+          <w:numId w:val="1003"/>
+        </w:numPr>
+      </w:pPr>
+      <w:r>
+        <w:t xml:space="preserve">GAP-4 closed:</w:t>
+      </w:r>
+      <w:r>
+        <w:t xml:space="preserve"> </w:t>
+      </w:r>
+      <w:r>
+        <w:rPr>
+          <w:rStyle w:val="VerbatimChar"/>
+        </w:rPr>
+        <w:t xml:space="preserve">v04-client/connector.md</w:t>
+      </w:r>
+      <w:r>
+        <w:t xml:space="preserve"> </w:t>
+      </w:r>
+      <w:r>
+        <w:t xml:space="preserve">created as the single owning doc for</w:t>
+      </w:r>
+      <w:r>
+        <w:t xml:space="preserve"> </w:t>
+      </w:r>
+      <w:r>
+        <w:t xml:space="preserve">FR-701..707; traceability matrix repointed.</w:t>
+      </w:r>
+    </w:p>
+    <w:p>
+      <w:pPr>
+        <w:pStyle w:val="Compact"/>
+        <w:numPr>
+          <w:ilvl w:val="0"/>
+          <w:numId w:val="1003"/>
+        </w:numPr>
+      </w:pPr>
+      <w:r>
+        <w:t xml:space="preserve">GAP-5 closed at doc level: all 15</w:t>
+      </w:r>
+      <w:r>
+        <w:t xml:space="preserve"> </w:t>
+      </w:r>
+      <w:r>
+        <w:rPr>
+          <w:rStyle w:val="VerbatimChar"/>
+        </w:rPr>
+        <w:t xml:space="preserve">v08-testing/</w:t>
+      </w:r>
+      <w:r>
+        <w:t xml:space="preserve"> </w:t>
+      </w:r>
+      <w:r>
+        <w:t xml:space="preserve">nano-detail docs authored and</w:t>
+      </w:r>
+      <w:r>
+        <w:t xml:space="preserve"> </w:t>
+      </w:r>
+      <w:r>
+        <w:t xml:space="preserve">mapped; evidence states honestly PENDING until build.</w:t>
+      </w:r>
+    </w:p>
+    <w:p>
+      <w:pPr>
+        <w:pStyle w:val="Compact"/>
+        <w:numPr>
+          <w:ilvl w:val="0"/>
+          <w:numId w:val="1003"/>
+        </w:numPr>
+      </w:pPr>
+      <w:r>
+        <w:t xml:space="preserve">GAP-6 closed: DDOS/RBAC/rate-limiting owners pinned; quantitative DDoS targets</w:t>
+      </w:r>
+      <w:r>
+        <w:t xml:space="preserve"> </w:t>
+      </w:r>
+      <w:r>
+        <w:t xml:space="preserve">defined in</w:t>
+      </w:r>
+      <w:r>
+        <w:t xml:space="preserve"> </w:t>
+      </w:r>
+      <w:r>
+        <w:rPr>
+          <w:rStyle w:val="VerbatimChar"/>
+        </w:rPr>
+        <w:t xml:space="preserve">v08-testing/ddos.md</w:t>
+      </w:r>
+      <w:r>
+        <w:t xml:space="preserve"> </w:t>
+      </w:r>
+      <w:r>
+        <w:t xml:space="preserve">§10.</w:t>
+      </w:r>
+    </w:p>
+    <w:p>
+      <w:pPr>
         <w:pStyle w:val="FirstParagraph"/>
       </w:pPr>
       <w:r>
@@ -975,19 +1161,40 @@
           <w:b/>
           <w:bCs/>
         </w:rPr>
-        <w:t xml:space="preserve">Honest residual gaps (not kick-off blockers):</w:t>
-      </w:r>
-      <w:r>
-        <w:t xml:space="preserve"> </w:t>
-      </w:r>
-      <w:r>
-        <w:t xml:space="preserve">GAP-3, GAP-4, GAP-5,</w:t>
-      </w:r>
-      <w:r>
-        <w:t xml:space="preserve"> </w:t>
-      </w:r>
-      <w:r>
-        <w:t xml:space="preserve">OpenDesign token-contract grade</w:t>
+        <w:t xml:space="preserve">Honest residual measurement gaps (not kick-off blockers):</w:t>
+      </w:r>
+      <w:r>
+        <w:t xml:space="preserve"> </w:t>
+      </w:r>
+      <w:r>
+        <w:t xml:space="preserve">NFR-205 RTO/RPO</w:t>
+      </w:r>
+      <w:r>
+        <w:t xml:space="preserve"> </w:t>
+      </w:r>
+      <w:r>
+        <w:t xml:space="preserve">numbers pending Phase-2 drill; NFR-413/NFR-414 DDoS</w:t>
+      </w:r>
+      <w:r>
+        <w:t xml:space="preserve"> </w:t>
+      </w:r>
+      <w:r>
+        <w:rPr>
+          <w:rStyle w:val="VerbatimChar"/>
+        </w:rPr>
+        <w:t xml:space="preserve">ATTACK_PPS</w:t>
+      </w:r>
+      <w:r>
+        <w:t xml:space="preserve"> </w:t>
+      </w:r>
+      <w:r>
+        <w:t xml:space="preserve">and legit-handshake</w:t>
+      </w:r>
+      <w:r>
+        <w:t xml:space="preserve"> </w:t>
+      </w:r>
+      <w:r>
+        <w:t xml:space="preserve">SLO pending Phase-2 benchmarks; OpenDesign token-contract grade</w:t>
       </w:r>
       <w:r>
         <w:t xml:space="preserve"> </w:t>
@@ -999,13 +1206,10 @@
         <w:t xml:space="preserve">needs-rebuild</w:t>
       </w:r>
       <w:r>
-        <w:t xml:space="preserve">, and Phase-2 DDoS attack-rate</w:t>
-      </w:r>
-      <w:r>
-        <w:t xml:space="preserve"> </w:t>
-      </w:r>
-      <w:r>
-        <w:t xml:space="preserve">constants. All are tracked in the coverage ledger, review reports, and handoff</w:t>
+        <w:t xml:space="preserve"> </w:t>
+      </w:r>
+      <w:r>
+        <w:t xml:space="preserve">accepted. All are tracked in the coverage ledger, review reports, and handoff</w:t>
       </w:r>
       <w:r>
         <w:t xml:space="preserve"> </w:t>

</xml_diff>